<commit_message>
fix(providers): harden API compatibility and Gemini JSON output
</commit_message>
<xml_diff>
--- a/SceneLens_使用手册.docx
+++ b/SceneLens_使用手册.docx
@@ -27,7 +27,7 @@
           <w:color w:val="5A5A5A"/>
           <w:sz w:val="19"/>
         </w:rPr>
-        <w:t>适用版本：0.4.0a0（M3 候选）　更新日期：2026-07-19</w:t>
+        <w:t>适用版本：0.4.0a0（M3 候选，Gemini 接口修正版）　更新日期：2026-07-28</w:t>
       </w:r>
     </w:p>
     <w:p>
@@ -68,7 +68,7 @@
           <w:b w:val="0"/>
           <w:sz w:val="22"/>
         </w:rPr>
-        <w:t>试用版：打开 dist/SceneLens/SceneLens.exe。</w:t>
+        <w:t>试用版：打开本次候选目录中的 SceneLens/SceneLens.exe，不要继续使用旧候选。</w:t>
       </w:r>
     </w:p>
     <w:p>
@@ -803,6 +803,166 @@
     </w:p>
     <w:p>
       <w:pPr>
+        <w:pStyle w:val="Heading2"/>
+      </w:pPr>
+      <w:r>
+        <w:rPr>
+          <w:rFonts w:ascii="Calibri" w:hAnsi="Calibri" w:eastAsia="Microsoft YaHei UI"/>
+          <w:b/>
+          <w:color w:val="2E74B5"/>
+          <w:sz w:val="26"/>
+        </w:rPr>
+        <w:t>AI 接口失败时</w:t>
+      </w:r>
+    </w:p>
+    <w:p>
+      <w:pPr>
+        <w:spacing w:before="0" w:after="80" w:line="300" w:lineRule="auto"/>
+        <w:numPr>
+          <w:ilvl w:val="0"/>
+          <w:numId w:val="10"/>
+        </w:numPr>
+      </w:pPr>
+      <w:r>
+        <w:rPr>
+          <w:rFonts w:ascii="Calibri" w:hAnsi="Calibri" w:eastAsia="Microsoft YaHei UI"/>
+          <w:b w:val="0"/>
+          <w:sz w:val="22"/>
+        </w:rPr>
+        <w:t>http_400：请求参数或模型不兼容；先恢复供应商默认模型后重试。</w:t>
+      </w:r>
+    </w:p>
+    <w:p>
+      <w:pPr>
+        <w:spacing w:before="0" w:after="80" w:line="300" w:lineRule="auto"/>
+        <w:numPr>
+          <w:ilvl w:val="0"/>
+          <w:numId w:val="10"/>
+        </w:numPr>
+      </w:pPr>
+      <w:r>
+        <w:rPr>
+          <w:rFonts w:ascii="Calibri" w:hAnsi="Calibri" w:eastAsia="Microsoft YaHei UI"/>
+          <w:b w:val="0"/>
+          <w:sz w:val="22"/>
+        </w:rPr>
+        <w:t>若错误包含 generation_config.response_format.text.mime_type，说明仍在运行旧版；关闭旧程序后改用本次 Gemini 接口修正版。</w:t>
+      </w:r>
+    </w:p>
+    <w:p>
+      <w:pPr>
+        <w:spacing w:before="0" w:after="80" w:line="300" w:lineRule="auto"/>
+        <w:numPr>
+          <w:ilvl w:val="0"/>
+          <w:numId w:val="10"/>
+        </w:numPr>
+      </w:pPr>
+      <w:r>
+        <w:rPr>
+          <w:rFonts w:ascii="Calibri" w:hAnsi="Calibri" w:eastAsia="Microsoft YaHei UI"/>
+          <w:b w:val="0"/>
+          <w:sz w:val="22"/>
+        </w:rPr>
+        <w:t>http_401：Key 错误、过期或不属于该供应商。</w:t>
+      </w:r>
+    </w:p>
+    <w:p>
+      <w:pPr>
+        <w:spacing w:before="0" w:after="80" w:line="300" w:lineRule="auto"/>
+        <w:numPr>
+          <w:ilvl w:val="0"/>
+          <w:numId w:val="10"/>
+        </w:numPr>
+      </w:pPr>
+      <w:r>
+        <w:rPr>
+          <w:rFonts w:ascii="Calibri" w:hAnsi="Calibri" w:eastAsia="Microsoft YaHei UI"/>
+          <w:b w:val="0"/>
+          <w:sz w:val="22"/>
+        </w:rPr>
+        <w:t>http_403：检查模型权限、服务开通、地域和 Key 所属工作区。</w:t>
+      </w:r>
+    </w:p>
+    <w:p>
+      <w:pPr>
+        <w:spacing w:before="0" w:after="80" w:line="300" w:lineRule="auto"/>
+        <w:numPr>
+          <w:ilvl w:val="0"/>
+          <w:numId w:val="10"/>
+        </w:numPr>
+      </w:pPr>
+      <w:r>
+        <w:rPr>
+          <w:rFonts w:ascii="Calibri" w:hAnsi="Calibri" w:eastAsia="Microsoft YaHei UI"/>
+          <w:b w:val="0"/>
+          <w:sz w:val="22"/>
+        </w:rPr>
+        <w:t>http_404：模型 ID 或接口不存在；改回默认模型。</w:t>
+      </w:r>
+    </w:p>
+    <w:p>
+      <w:pPr>
+        <w:spacing w:before="0" w:after="80" w:line="300" w:lineRule="auto"/>
+        <w:numPr>
+          <w:ilvl w:val="0"/>
+          <w:numId w:val="10"/>
+        </w:numPr>
+      </w:pPr>
+      <w:r>
+        <w:rPr>
+          <w:rFonts w:ascii="Calibri" w:hAnsi="Calibri" w:eastAsia="Microsoft YaHei UI"/>
+          <w:b w:val="0"/>
+          <w:sz w:val="22"/>
+        </w:rPr>
+        <w:t>http_413：降低发送分辨率后重试。</w:t>
+      </w:r>
+    </w:p>
+    <w:p>
+      <w:pPr>
+        <w:spacing w:before="0" w:after="80" w:line="300" w:lineRule="auto"/>
+        <w:numPr>
+          <w:ilvl w:val="0"/>
+          <w:numId w:val="10"/>
+        </w:numPr>
+      </w:pPr>
+      <w:r>
+        <w:rPr>
+          <w:rFonts w:ascii="Calibri" w:hAnsi="Calibri" w:eastAsia="Microsoft YaHei UI"/>
+          <w:b w:val="0"/>
+          <w:sz w:val="22"/>
+        </w:rPr>
+        <w:t>http_429：额度不足或调用过快，检查控制台后稍后重试。</w:t>
+      </w:r>
+    </w:p>
+    <w:p>
+      <w:pPr>
+        <w:spacing w:before="0" w:after="80" w:line="300" w:lineRule="auto"/>
+        <w:numPr>
+          <w:ilvl w:val="0"/>
+          <w:numId w:val="10"/>
+        </w:numPr>
+      </w:pPr>
+      <w:r>
+        <w:rPr>
+          <w:rFonts w:ascii="Calibri" w:hAnsi="Calibri" w:eastAsia="Microsoft YaHei UI"/>
+          <w:b w:val="0"/>
+          <w:sz w:val="22"/>
+        </w:rPr>
+        <w:t>http_5xx：供应商服务异常，稍后重试。</w:t>
+      </w:r>
+    </w:p>
+    <w:p>
+      <w:r>
+        <w:rPr>
+          <w:rFonts w:ascii="Calibri" w:hAnsi="Calibri" w:eastAsia="Microsoft YaHei UI"/>
+          <w:b w:val="0"/>
+          <w:sz w:val="22"/>
+        </w:rPr>
+        <w:t>错误窗口会显示供应商返回的脱敏原因。不要把 API Key 截图或复制给他人。</w:t>
+      </w:r>
+    </w:p>
+    <w:p>
+      <w:pPr>
         <w:pStyle w:val="Heading1"/>
       </w:pPr>
       <w:r>

</xml_diff>

<commit_message>
feat: deliver M4 deep art direction review
</commit_message>
<xml_diff>
--- a/SceneLens_使用手册.docx
+++ b/SceneLens_使用手册.docx
@@ -27,7 +27,7 @@
           <w:color w:val="5A5A5A"/>
           <w:sz w:val="19"/>
         </w:rPr>
-        <w:t>适用版本：0.4.0a0（M3 候选，Gemini 接口修正版）　更新日期：2026-07-28</w:t>
+        <w:t>适用版本：0.5.0a0（M4 深度主美审阅与构图诊断候选）　更新日期：2026-07-28</w:t>
       </w:r>
     </w:p>
     <w:p>
@@ -184,7 +184,7 @@
           <w:b w:val="0"/>
           <w:sz w:val="22"/>
         </w:rPr>
-        <w:t>顶部：导入、显示、模糊、剪影、A/B 和同步视图。</w:t>
+        <w:t>顶部：导入、显示、模糊、剪影、A/B、同步视图和构图辅助。</w:t>
       </w:r>
     </w:p>
     <w:p>
@@ -427,6 +427,23 @@
           <w:sz w:val="22"/>
         </w:rPr>
         <w:t>按 Esc 退出颜色遮罩、灯光标注、区域模式或优化预览。</w:t>
+      </w:r>
+    </w:p>
+    <w:p>
+      <w:pPr>
+        <w:spacing w:before="0" w:after="80" w:line="300" w:lineRule="auto"/>
+        <w:numPr>
+          <w:ilvl w:val="0"/>
+          <w:numId w:val="10"/>
+        </w:numPr>
+      </w:pPr>
+      <w:r>
+        <w:rPr>
+          <w:rFonts w:ascii="Calibri" w:hAnsi="Calibri" w:eastAsia="Microsoft YaHei UI"/>
+          <w:b w:val="0"/>
+          <w:sz w:val="22"/>
+        </w:rPr>
+        <w:t>构图辅助提供三分法、黄金分割、对角线、中心、三角形、单点透视和两点透视；只用于人工观察。</w:t>
       </w:r>
     </w:p>
     <w:p>
@@ -720,7 +737,7 @@
           <w:b w:val="0"/>
           <w:sz w:val="22"/>
         </w:rPr>
-        <w:t>选择“主美专项审阅”或“灯光专项审阅”。</w:t>
+        <w:t>优先选择“深度主美审阅（八维）”；专项灯光问题选择“灯光专项审阅”。</w:t>
       </w:r>
     </w:p>
     <w:p>
@@ -799,6 +816,105 @@
           <w:sz w:val="22"/>
         </w:rPr>
         <w:t>“第二意见”会增加一次模型调用和费用，默认关闭。</w:t>
+      </w:r>
+    </w:p>
+    <w:p>
+      <w:pPr>
+        <w:pStyle w:val="Heading2"/>
+      </w:pPr>
+      <w:r>
+        <w:rPr>
+          <w:rFonts w:ascii="Calibri" w:hAnsi="Calibri" w:eastAsia="Microsoft YaHei UI"/>
+          <w:b/>
+          <w:color w:val="2E74B5"/>
+          <w:sz w:val="26"/>
+        </w:rPr>
+        <w:t>深度主美审阅</w:t>
+      </w:r>
+    </w:p>
+    <w:p>
+      <w:pPr>
+        <w:spacing w:before="0" w:after="80" w:line="300" w:lineRule="auto"/>
+        <w:numPr>
+          <w:ilvl w:val="0"/>
+          <w:numId w:val="10"/>
+        </w:numPr>
+      </w:pPr>
+      <w:r>
+        <w:rPr>
+          <w:rFonts w:ascii="Calibri" w:hAnsi="Calibri" w:eastAsia="Microsoft YaHei UI"/>
+          <w:b w:val="0"/>
+          <w:sz w:val="22"/>
+        </w:rPr>
+        <w:t>八个维度：构图、视觉引导、焦点层级、色彩、明度、灯光、材质和世界设计。</w:t>
+      </w:r>
+    </w:p>
+    <w:p>
+      <w:pPr>
+        <w:spacing w:before="0" w:after="80" w:line="300" w:lineRule="auto"/>
+        <w:numPr>
+          <w:ilvl w:val="0"/>
+          <w:numId w:val="10"/>
+        </w:numPr>
+      </w:pPr>
+      <w:r>
+        <w:rPr>
+          <w:rFonts w:ascii="Calibri" w:hAnsi="Calibri" w:eastAsia="Microsoft YaHei UI"/>
+          <w:b w:val="0"/>
+          <w:sz w:val="22"/>
+        </w:rPr>
+        <w:t>每个维度分开显示制作目标、参考呈现、当前效果、优点、风险和不确定性。</w:t>
+      </w:r>
+    </w:p>
+    <w:p>
+      <w:pPr>
+        <w:spacing w:before="0" w:after="80" w:line="300" w:lineRule="auto"/>
+        <w:numPr>
+          <w:ilvl w:val="0"/>
+          <w:numId w:val="10"/>
+        </w:numPr>
+      </w:pPr>
+      <w:r>
+        <w:rPr>
+          <w:rFonts w:ascii="Calibri" w:hAnsi="Calibri" w:eastAsia="Microsoft YaHei UI"/>
+          <w:b w:val="0"/>
+          <w:sz w:val="22"/>
+        </w:rPr>
+        <w:t>最多五个核心问题，并给出保留项、UE 执行顺序和下一版验证方法。</w:t>
+      </w:r>
+    </w:p>
+    <w:p>
+      <w:pPr>
+        <w:spacing w:before="0" w:after="80" w:line="300" w:lineRule="auto"/>
+        <w:numPr>
+          <w:ilvl w:val="0"/>
+          <w:numId w:val="10"/>
+        </w:numPr>
+      </w:pPr>
+      <w:r>
+        <w:rPr>
+          <w:rFonts w:ascii="Calibri" w:hAnsi="Calibri" w:eastAsia="Microsoft YaHei UI"/>
+          <w:b w:val="0"/>
+          <w:sz w:val="22"/>
+        </w:rPr>
+        <w:t>本地证据显示测量支持、部分支持、存在冲突或无法验证；冲突不会被隐藏。</w:t>
+      </w:r>
+    </w:p>
+    <w:p>
+      <w:pPr>
+        <w:spacing w:before="0" w:after="80" w:line="300" w:lineRule="auto"/>
+        <w:numPr>
+          <w:ilvl w:val="0"/>
+          <w:numId w:val="10"/>
+        </w:numPr>
+      </w:pPr>
+      <w:r>
+        <w:rPr>
+          <w:rFonts w:ascii="Calibri" w:hAnsi="Calibri" w:eastAsia="Microsoft YaHei UI"/>
+          <w:b w:val="0"/>
+          <w:sz w:val="22"/>
+        </w:rPr>
+        <w:t>离线 Mock 只验证界面和 JSON 流程，不会在本地分析图片，也不代表真实审阅。</w:t>
       </w:r>
     </w:p>
     <w:p>

</xml_diff>

<commit_message>
fix(providers): harden Gemini deep review schema
</commit_message>
<xml_diff>
--- a/SceneLens_使用手册.docx
+++ b/SceneLens_使用手册.docx
@@ -27,7 +27,7 @@
           <w:color w:val="5A5A5A"/>
           <w:sz w:val="19"/>
         </w:rPr>
-        <w:t>适用版本：0.5.0a0（M4 深度主美审阅与构图诊断候选）　更新日期：2026-07-28</w:t>
+        <w:t>适用版本：0.5.0a1（M4 深度主美审阅接口修复候选）　更新日期：2026-07-28</w:t>
       </w:r>
     </w:p>
     <w:p>
@@ -945,7 +945,7 @@
           <w:b w:val="0"/>
           <w:sz w:val="22"/>
         </w:rPr>
-        <w:t>http_400：请求参数或模型不兼容；先恢复供应商默认模型后重试。</w:t>
+        <w:t>http_400：请求参数或模型不兼容。新版会自动处理 Gemini 深度审阅的复杂 Schema；仍失败时先确认正在运行 0.5.0a1，再恢复默认模型重试。</w:t>
       </w:r>
     </w:p>
     <w:p>

</xml_diff>

<commit_message>
fix(providers): repair Gemini structured review output
</commit_message>
<xml_diff>
--- a/SceneLens_使用手册.docx
+++ b/SceneLens_使用手册.docx
@@ -27,7 +27,7 @@
           <w:color w:val="5A5A5A"/>
           <w:sz w:val="19"/>
         </w:rPr>
-        <w:t>适用版本：0.5.0a1（M4 深度主美审阅接口修复候选）　更新日期：2026-07-28</w:t>
+        <w:t>适用版本：0.5.0a2（M4 深度主美审阅结构纠错候选）　更新日期：2026-07-28</w:t>
       </w:r>
     </w:p>
     <w:p>
@@ -945,7 +945,7 @@
           <w:b w:val="0"/>
           <w:sz w:val="22"/>
         </w:rPr>
-        <w:t>http_400：请求参数或模型不兼容。新版会自动处理 Gemini 深度审阅的复杂 Schema；仍失败时先确认正在运行 0.5.0a1，再恢复默认模型重试。</w:t>
+        <w:t>http_400：请求参数或模型不兼容。新版会自动处理 Gemini 深度审阅的复杂 Schema；仍失败时先确认正在运行 0.5.0a2，再恢复默认模型重试。</w:t>
       </w:r>
     </w:p>
     <w:p>
@@ -963,6 +963,23 @@
           <w:sz w:val="22"/>
         </w:rPr>
         <w:t>若错误包含 generation_config.response_format.text.mime_type，说明仍在运行旧版；关闭旧程序后改用本次 Gemini 接口修正版。</w:t>
+      </w:r>
+    </w:p>
+    <w:p>
+      <w:pPr>
+        <w:spacing w:before="0" w:after="80" w:line="300" w:lineRule="auto"/>
+        <w:numPr>
+          <w:ilvl w:val="0"/>
+          <w:numId w:val="10"/>
+        </w:numPr>
+      </w:pPr>
+      <w:r>
+        <w:rPr>
+          <w:rFonts w:ascii="Calibri" w:hAnsi="Calibri" w:eastAsia="Microsoft YaHei UI"/>
+          <w:b w:val="0"/>
+          <w:sz w:val="22"/>
+        </w:rPr>
+        <w:t>Gemini 首次返回的 JSON 结构不完整时，SceneLens 最多自动纠错一次。确认发送窗口会提示该过程可能再次发送同一审阅副本并增加少量费用。</w:t>
       </w:r>
     </w:p>
     <w:p>

</xml_diff>

<commit_message>
fix(reviews): tolerate dangling finding links
</commit_message>
<xml_diff>
--- a/SceneLens_使用手册.docx
+++ b/SceneLens_使用手册.docx
@@ -27,7 +27,7 @@
           <w:color w:val="5A5A5A"/>
           <w:sz w:val="19"/>
         </w:rPr>
-        <w:t>适用版本：0.5.0a2（M4 深度主美审阅结构纠错候选）　更新日期：2026-07-28</w:t>
+        <w:t>适用版本：0.5.0a3（M4 深度主美审阅引用完整性修复候选）　更新日期：2026-07-28</w:t>
       </w:r>
     </w:p>
     <w:p>
@@ -945,7 +945,7 @@
           <w:b w:val="0"/>
           <w:sz w:val="22"/>
         </w:rPr>
-        <w:t>http_400：请求参数或模型不兼容。新版会自动处理 Gemini 深度审阅的复杂 Schema；仍失败时先确认正在运行 0.5.0a2，再恢复默认模型重试。</w:t>
+        <w:t>http_400：请求参数或模型不兼容。新版会自动处理 Gemini 深度审阅的复杂 Schema；仍失败时先确认正在运行 0.5.0a3，再恢复默认模型重试。</w:t>
       </w:r>
     </w:p>
     <w:p>
@@ -980,6 +980,23 @@
           <w:sz w:val="22"/>
         </w:rPr>
         <w:t>Gemini 首次返回的 JSON 结构不完整时，SceneLens 最多自动纠错一次。确认发送窗口会提示该过程可能再次发送同一审阅副本并增加少量费用。</w:t>
+      </w:r>
+    </w:p>
+    <w:p>
+      <w:pPr>
+        <w:spacing w:before="0" w:after="80" w:line="300" w:lineRule="auto"/>
+        <w:numPr>
+          <w:ilvl w:val="0"/>
+          <w:numId w:val="10"/>
+        </w:numPr>
+      </w:pPr>
+      <w:r>
+        <w:rPr>
+          <w:rFonts w:ascii="Calibri" w:hAnsi="Calibri" w:eastAsia="Microsoft YaHei UI"/>
+          <w:b w:val="0"/>
+          <w:sz w:val="22"/>
+        </w:rPr>
+        <w:t>若 AI 引用了本次报告中不存在的问题 ID，0.5.0a3 会取消无效链接并继续显示完整报告，不追加 API 调用。界面的“结构修复”只表示链接已取消，正文和真实问题没有被改写。</w:t>
       </w:r>
     </w:p>
     <w:p>

</xml_diff>

<commit_message>
fix(providers): recover malformed Gemini JSON
</commit_message>
<xml_diff>
--- a/SceneLens_使用手册.docx
+++ b/SceneLens_使用手册.docx
@@ -27,7 +27,7 @@
           <w:color w:val="5A5A5A"/>
           <w:sz w:val="19"/>
         </w:rPr>
-        <w:t>适用版本：0.5.0a3（M4 深度主美审阅引用完整性修复候选）　更新日期：2026-07-28</w:t>
+        <w:t>适用版本：0.5.0a4（M4 Gemini 损坏 JSON 自动恢复候选）　更新日期：2026-07-28</w:t>
       </w:r>
     </w:p>
     <w:p>
@@ -945,7 +945,7 @@
           <w:b w:val="0"/>
           <w:sz w:val="22"/>
         </w:rPr>
-        <w:t>http_400：请求参数或模型不兼容。新版会自动处理 Gemini 深度审阅的复杂 Schema；仍失败时先确认正在运行 0.5.0a3，再恢复默认模型重试。</w:t>
+        <w:t>http_400：请求参数或模型不兼容。新版会自动处理 Gemini 深度审阅的复杂 Schema；仍失败时先确认正在运行 0.5.0a4，再恢复默认模型重试。</w:t>
       </w:r>
     </w:p>
     <w:p>
@@ -979,7 +979,24 @@
           <w:b w:val="0"/>
           <w:sz w:val="22"/>
         </w:rPr>
-        <w:t>Gemini 首次返回的 JSON 结构不完整时，SceneLens 最多自动纠错一次。确认发送窗口会提示该过程可能再次发送同一审阅副本并增加少量费用。</w:t>
+        <w:t>Gemini 首次返回的 JSON 语法损坏、被截断或结构不完整时，SceneLens 最多自动纠错一次。确认发送窗口会提示该过程可能再次发送同一审阅副本并增加少量费用。</w:t>
+      </w:r>
+    </w:p>
+    <w:p>
+      <w:pPr>
+        <w:spacing w:before="0" w:after="80" w:line="300" w:lineRule="auto"/>
+        <w:numPr>
+          <w:ilvl w:val="0"/>
+          <w:numId w:val="10"/>
+        </w:numPr>
+      </w:pPr>
+      <w:r>
+        <w:rPr>
+          <w:rFonts w:ascii="Calibri" w:hAnsi="Calibri" w:eastAsia="Microsoft YaHei UI"/>
+          <w:b w:val="0"/>
+          <w:sz w:val="22"/>
+        </w:rPr>
+        <w:t>错误中的 line 和 column 表示 AI 返回文本的 JSON 损坏位置，不表示 API Key 错误。0.5.0a4 会把原始返回交给同一模型压缩并修复；第二次仍损坏时停止，不会无限重试。</w:t>
       </w:r>
     </w:p>
     <w:p>

</xml_diff>

<commit_message>
docs: deliver M5 artwork study candidate
</commit_message>
<xml_diff>
--- a/SceneLens_使用手册.docx
+++ b/SceneLens_使用手册.docx
@@ -27,7 +27,7 @@
           <w:color w:val="5A5A5A"/>
           <w:sz w:val="19"/>
         </w:rPr>
-        <w:t>适用版本：0.5.0a4（M4 Gemini 损坏 JSON 自动恢复候选）　更新日期：2026-07-28</w:t>
+        <w:t>适用版本：0.6.0a0（M5 作品研究候选）　更新日期：2026-07-30</w:t>
       </w:r>
     </w:p>
     <w:p>
@@ -116,7 +116,7 @@
           <w:color w:val="2E74B5"/>
           <w:sz w:val="32"/>
         </w:rPr>
-        <w:t>2. 界面</w:t>
+        <w:t>2. 工作台首页</w:t>
       </w:r>
     </w:p>
     <w:p>
@@ -133,7 +133,7 @@
           <w:b w:val="0"/>
           <w:sz w:val="22"/>
         </w:rPr>
-        <w:t>左侧：Project、Shot、Version 导航。</w:t>
+        <w:t>场景美术控制：参考图与自己的 UE 截图对比、审阅、任务和版本复查。</w:t>
       </w:r>
     </w:p>
     <w:p>
@@ -150,7 +150,7 @@
           <w:b w:val="0"/>
           <w:sz w:val="22"/>
         </w:rPr>
-        <w:t>中间：参考图和当前 UE 截图。</w:t>
+        <w:t>作品研究：分析一张原画、概念图、Color Key 或优秀场景作品。</w:t>
       </w:r>
     </w:p>
     <w:p>
@@ -167,24 +167,7 @@
           <w:b w:val="0"/>
           <w:sz w:val="22"/>
         </w:rPr>
-        <w:t>右侧：参考分析、截图分析、对比分析、AI 审阅与任务、优化实验室。</w:t>
-      </w:r>
-    </w:p>
-    <w:p>
-      <w:pPr>
-        <w:spacing w:before="0" w:after="80" w:line="300" w:lineRule="auto"/>
-        <w:numPr>
-          <w:ilvl w:val="0"/>
-          <w:numId w:val="10"/>
-        </w:numPr>
-      </w:pPr>
-      <w:r>
-        <w:rPr>
-          <w:rFonts w:ascii="Calibri" w:hAnsi="Calibri" w:eastAsia="Microsoft YaHei UI"/>
-          <w:b w:val="0"/>
-          <w:sz w:val="22"/>
-        </w:rPr>
-        <w:t>顶部：导入、显示、模糊、剪影、A/B、同步视图和构图辅助。</w:t>
+        <w:t>模块内选择“文件 → 工作台首页”可返回。</w:t>
       </w:r>
     </w:p>
     <w:p>
@@ -198,7 +181,359 @@
           <w:color w:val="2E74B5"/>
           <w:sz w:val="32"/>
         </w:rPr>
-        <w:t>3. 最短工作流程</w:t>
+        <w:t>3. 作品研究</w:t>
+      </w:r>
+    </w:p>
+    <w:p>
+      <w:pPr>
+        <w:pStyle w:val="Heading2"/>
+      </w:pPr>
+      <w:r>
+        <w:rPr>
+          <w:rFonts w:ascii="Calibri" w:hAnsi="Calibri" w:eastAsia="Microsoft YaHei UI"/>
+          <w:b/>
+          <w:color w:val="2E74B5"/>
+          <w:sz w:val="26"/>
+        </w:rPr>
+        <w:t>最短流程</w:t>
+      </w:r>
+    </w:p>
+    <w:p>
+      <w:pPr>
+        <w:spacing w:before="0" w:after="80" w:line="300" w:lineRule="auto"/>
+        <w:numPr>
+          <w:ilvl w:val="0"/>
+          <w:numId w:val="11"/>
+        </w:numPr>
+      </w:pPr>
+      <w:r>
+        <w:rPr>
+          <w:rFonts w:ascii="Calibri" w:hAnsi="Calibri" w:eastAsia="Microsoft YaHei UI"/>
+          <w:b w:val="0"/>
+          <w:sz w:val="22"/>
+        </w:rPr>
+        <w:t>在首页选择“作品研究”。</w:t>
+      </w:r>
+    </w:p>
+    <w:p>
+      <w:pPr>
+        <w:spacing w:before="0" w:after="80" w:line="300" w:lineRule="auto"/>
+        <w:numPr>
+          <w:ilvl w:val="0"/>
+          <w:numId w:val="11"/>
+        </w:numPr>
+      </w:pPr>
+      <w:r>
+        <w:rPr>
+          <w:rFonts w:ascii="Calibri" w:hAnsi="Calibri" w:eastAsia="Microsoft YaHei UI"/>
+          <w:b w:val="0"/>
+          <w:sz w:val="22"/>
+        </w:rPr>
+        <w:t>点击“新建作品研究”，选择目录并输入标题。</w:t>
+      </w:r>
+    </w:p>
+    <w:p>
+      <w:pPr>
+        <w:spacing w:before="0" w:after="80" w:line="300" w:lineRule="auto"/>
+        <w:numPr>
+          <w:ilvl w:val="0"/>
+          <w:numId w:val="11"/>
+        </w:numPr>
+      </w:pPr>
+      <w:r>
+        <w:rPr>
+          <w:rFonts w:ascii="Calibri" w:hAnsi="Calibri" w:eastAsia="Microsoft YaHei UI"/>
+          <w:b w:val="0"/>
+          <w:sz w:val="22"/>
+        </w:rPr>
+        <w:t>导入一张图片。</w:t>
+      </w:r>
+    </w:p>
+    <w:p>
+      <w:pPr>
+        <w:spacing w:before="0" w:after="80" w:line="300" w:lineRule="auto"/>
+        <w:numPr>
+          <w:ilvl w:val="0"/>
+          <w:numId w:val="11"/>
+        </w:numPr>
+      </w:pPr>
+      <w:r>
+        <w:rPr>
+          <w:rFonts w:ascii="Calibri" w:hAnsi="Calibri" w:eastAsia="Microsoft YaHei UI"/>
+          <w:b w:val="0"/>
+          <w:sz w:val="22"/>
+        </w:rPr>
+        <w:t>填写作品类型、本次想研究什么和已知背景。</w:t>
+      </w:r>
+    </w:p>
+    <w:p>
+      <w:pPr>
+        <w:spacing w:before="0" w:after="80" w:line="300" w:lineRule="auto"/>
+        <w:numPr>
+          <w:ilvl w:val="0"/>
+          <w:numId w:val="11"/>
+        </w:numPr>
+      </w:pPr>
+      <w:r>
+        <w:rPr>
+          <w:rFonts w:ascii="Calibri" w:hAnsi="Calibri" w:eastAsia="Microsoft YaHei UI"/>
+          <w:b w:val="0"/>
+          <w:sz w:val="22"/>
+        </w:rPr>
+        <w:t>在“本地证据”查看明度、色板、空间网格和注意力代理。</w:t>
+      </w:r>
+    </w:p>
+    <w:p>
+      <w:pPr>
+        <w:spacing w:before="0" w:after="80" w:line="300" w:lineRule="auto"/>
+        <w:numPr>
+          <w:ilvl w:val="0"/>
+          <w:numId w:val="11"/>
+        </w:numPr>
+      </w:pPr>
+      <w:r>
+        <w:rPr>
+          <w:rFonts w:ascii="Calibri" w:hAnsi="Calibri" w:eastAsia="Microsoft YaHei UI"/>
+          <w:b w:val="0"/>
+          <w:sz w:val="22"/>
+        </w:rPr>
+        <w:t>在“专家拆解”选择视觉 AI，查看发送清单后主动确认。</w:t>
+      </w:r>
+    </w:p>
+    <w:p>
+      <w:pPr>
+        <w:spacing w:before="0" w:after="80" w:line="300" w:lineRule="auto"/>
+        <w:numPr>
+          <w:ilvl w:val="0"/>
+          <w:numId w:val="11"/>
+        </w:numPr>
+      </w:pPr>
+      <w:r>
+        <w:rPr>
+          <w:rFonts w:ascii="Calibri" w:hAnsi="Calibri" w:eastAsia="Microsoft YaHei UI"/>
+          <w:b w:val="0"/>
+          <w:sz w:val="22"/>
+        </w:rPr>
+        <w:t>阅读十二维拆解和跨维度因果链。</w:t>
+      </w:r>
+    </w:p>
+    <w:p>
+      <w:pPr>
+        <w:spacing w:before="0" w:after="80" w:line="300" w:lineRule="auto"/>
+        <w:numPr>
+          <w:ilvl w:val="0"/>
+          <w:numId w:val="11"/>
+        </w:numPr>
+      </w:pPr>
+      <w:r>
+        <w:rPr>
+          <w:rFonts w:ascii="Calibri" w:hAnsi="Calibri" w:eastAsia="Microsoft YaHei UI"/>
+          <w:b w:val="0"/>
+          <w:sz w:val="22"/>
+        </w:rPr>
+        <w:t>在“学习笔记”写下自己的判断，保存。</w:t>
+      </w:r>
+    </w:p>
+    <w:p>
+      <w:pPr>
+        <w:pStyle w:val="Heading2"/>
+      </w:pPr>
+      <w:r>
+        <w:rPr>
+          <w:rFonts w:ascii="Calibri" w:hAnsi="Calibri" w:eastAsia="Microsoft YaHei UI"/>
+          <w:b/>
+          <w:color w:val="2E74B5"/>
+          <w:sz w:val="26"/>
+        </w:rPr>
+        <w:t>本地观察</w:t>
+      </w:r>
+    </w:p>
+    <w:p>
+      <w:pPr>
+        <w:spacing w:before="0" w:after="80" w:line="300" w:lineRule="auto"/>
+        <w:numPr>
+          <w:ilvl w:val="0"/>
+          <w:numId w:val="10"/>
+        </w:numPr>
+      </w:pPr>
+      <w:r>
+        <w:rPr>
+          <w:rFonts w:ascii="Calibri" w:hAnsi="Calibri" w:eastAsia="Microsoft YaHei UI"/>
+          <w:b w:val="0"/>
+          <w:sz w:val="22"/>
+        </w:rPr>
+        <w:t>支持原图、灰度、三阶/五阶明度、伪色、溢出警告、剪影、缩略图、明度模糊和灯光明度代理图。</w:t>
+      </w:r>
+    </w:p>
+    <w:p>
+      <w:pPr>
+        <w:spacing w:before="0" w:after="80" w:line="300" w:lineRule="auto"/>
+        <w:numPr>
+          <w:ilvl w:val="0"/>
+          <w:numId w:val="10"/>
+        </w:numPr>
+      </w:pPr>
+      <w:r>
+        <w:rPr>
+          <w:rFonts w:ascii="Calibri" w:hAnsi="Calibri" w:eastAsia="Microsoft YaHei UI"/>
+          <w:b w:val="0"/>
+          <w:sz w:val="22"/>
+        </w:rPr>
+        <w:t>构图辅助包括三分法、黄金分割、对角线、中心、三角形和透视线。</w:t>
+      </w:r>
+    </w:p>
+    <w:p>
+      <w:pPr>
+        <w:spacing w:before="0" w:after="80" w:line="300" w:lineRule="auto"/>
+        <w:numPr>
+          <w:ilvl w:val="0"/>
+          <w:numId w:val="10"/>
+        </w:numPr>
+      </w:pPr>
+      <w:r>
+        <w:rPr>
+          <w:rFonts w:ascii="Calibri" w:hAnsi="Calibri" w:eastAsia="Microsoft YaHei UI"/>
+          <w:b w:val="0"/>
+          <w:sz w:val="22"/>
+        </w:rPr>
+        <w:t>点击 Oklab 色板颜色可查看来源区域；按 Esc 退出。</w:t>
+      </w:r>
+    </w:p>
+    <w:p>
+      <w:pPr>
+        <w:spacing w:before="0" w:after="80" w:line="300" w:lineRule="auto"/>
+        <w:numPr>
+          <w:ilvl w:val="0"/>
+          <w:numId w:val="10"/>
+        </w:numPr>
+      </w:pPr>
+      <w:r>
+        <w:rPr>
+          <w:rFonts w:ascii="Calibri" w:hAnsi="Calibri" w:eastAsia="Microsoft YaHei UI"/>
+          <w:b w:val="0"/>
+          <w:sz w:val="22"/>
+        </w:rPr>
+        <w:t>注意力代理只综合局部反差、边缘密度和彩度，不是眼动、显著性或好坏判断。</w:t>
+      </w:r>
+    </w:p>
+    <w:p>
+      <w:pPr>
+        <w:pStyle w:val="Heading2"/>
+      </w:pPr>
+      <w:r>
+        <w:rPr>
+          <w:rFonts w:ascii="Calibri" w:hAnsi="Calibri" w:eastAsia="Microsoft YaHei UI"/>
+          <w:b/>
+          <w:color w:val="2E74B5"/>
+          <w:sz w:val="26"/>
+        </w:rPr>
+        <w:t>AI 专家拆解</w:t>
+      </w:r>
+    </w:p>
+    <w:p>
+      <w:pPr>
+        <w:spacing w:before="0" w:after="80" w:line="300" w:lineRule="auto"/>
+        <w:numPr>
+          <w:ilvl w:val="0"/>
+          <w:numId w:val="10"/>
+        </w:numPr>
+      </w:pPr>
+      <w:r>
+        <w:rPr>
+          <w:rFonts w:ascii="Calibri" w:hAnsi="Calibri" w:eastAsia="Microsoft YaHei UI"/>
+          <w:b w:val="0"/>
+          <w:sz w:val="22"/>
+        </w:rPr>
+        <w:t>十二个维度：构图、视觉层级、明度、色彩、光、空间、形状、边缘细节、材质、环境叙事、风格技法和情绪。</w:t>
+      </w:r>
+    </w:p>
+    <w:p>
+      <w:pPr>
+        <w:spacing w:before="0" w:after="80" w:line="300" w:lineRule="auto"/>
+        <w:numPr>
+          <w:ilvl w:val="0"/>
+          <w:numId w:val="10"/>
+        </w:numPr>
+      </w:pPr>
+      <w:r>
+        <w:rPr>
+          <w:rFonts w:ascii="Calibri" w:hAnsi="Calibri" w:eastAsia="Microsoft YaHei UI"/>
+          <w:b w:val="0"/>
+          <w:sz w:val="22"/>
+        </w:rPr>
+        <w:t>每项包含观察、画面证据、测量证据、解释、观看效果、评价取舍、学习点和不确定性。</w:t>
+      </w:r>
+    </w:p>
+    <w:p>
+      <w:pPr>
+        <w:spacing w:before="0" w:after="80" w:line="300" w:lineRule="auto"/>
+        <w:numPr>
+          <w:ilvl w:val="0"/>
+          <w:numId w:val="10"/>
+        </w:numPr>
+      </w:pPr>
+      <w:r>
+        <w:rPr>
+          <w:rFonts w:ascii="Calibri" w:hAnsi="Calibri" w:eastAsia="Microsoft YaHei UI"/>
+          <w:b w:val="0"/>
+          <w:sz w:val="22"/>
+        </w:rPr>
+        <w:t>另外显示跨维度因果链、具体场景内容、画面标注、可迁移规律和继续观察问题。</w:t>
+      </w:r>
+    </w:p>
+    <w:p>
+      <w:pPr>
+        <w:spacing w:before="0" w:after="80" w:line="300" w:lineRule="auto"/>
+        <w:numPr>
+          <w:ilvl w:val="0"/>
+          <w:numId w:val="10"/>
+        </w:numPr>
+      </w:pPr>
+      <w:r>
+        <w:rPr>
+          <w:rFonts w:ascii="Calibri" w:hAnsi="Calibri" w:eastAsia="Microsoft YaHei UI"/>
+          <w:b w:val="0"/>
+          <w:sz w:val="22"/>
+        </w:rPr>
+        <w:t>离线 Mock 只验证流程，不分析图片语义，也不代表本地 AI 推理。</w:t>
+      </w:r>
+    </w:p>
+    <w:p>
+      <w:pPr>
+        <w:pStyle w:val="Heading2"/>
+      </w:pPr>
+      <w:r>
+        <w:rPr>
+          <w:rFonts w:ascii="Calibri" w:hAnsi="Calibri" w:eastAsia="Microsoft YaHei UI"/>
+          <w:b/>
+          <w:color w:val="2E74B5"/>
+          <w:sz w:val="26"/>
+        </w:rPr>
+        <w:t>保存内容</w:t>
+      </w:r>
+    </w:p>
+    <w:p>
+      <w:r>
+        <w:rPr>
+          <w:rFonts w:ascii="Calibri" w:hAnsi="Calibri" w:eastAsia="Microsoft YaHei UI"/>
+          <w:b w:val="0"/>
+          <w:sz w:val="22"/>
+        </w:rPr>
+        <w:t>.scenelens-study 目录保存原图副本、SHA-256、本地证据、AI 结果、研究目标、已知背景、观察状态和个人笔记。原始图片不会被覆盖。</w:t>
+      </w:r>
+    </w:p>
+    <w:p>
+      <w:pPr>
+        <w:pStyle w:val="Heading1"/>
+      </w:pPr>
+      <w:r>
+        <w:rPr>
+          <w:rFonts w:ascii="Calibri" w:hAnsi="Calibri" w:eastAsia="Microsoft YaHei UI"/>
+          <w:b/>
+          <w:color w:val="2E74B5"/>
+          <w:sz w:val="32"/>
+        </w:rPr>
+        <w:t>4. 场景美术控制最短流程</w:t>
       </w:r>
     </w:p>
     <w:p>
@@ -358,7 +693,7 @@
           <w:color w:val="2E74B5"/>
           <w:sz w:val="32"/>
         </w:rPr>
-        <w:t>4. 图片查看与基础分析</w:t>
+        <w:t>5. 场景图片查看与基础分析</w:t>
       </w:r>
     </w:p>
     <w:p>
@@ -484,7 +819,7 @@
           <w:color w:val="2E74B5"/>
           <w:sz w:val="32"/>
         </w:rPr>
-        <w:t>5. 对比分析</w:t>
+        <w:t>6. 对比分析</w:t>
       </w:r>
     </w:p>
     <w:p>
@@ -638,7 +973,7 @@
           <w:color w:val="2E74B5"/>
           <w:sz w:val="32"/>
         </w:rPr>
-        <w:t>6. 制作意图与参考图视觉简报</w:t>
+        <w:t>7. 制作意图与参考图视觉简报</w:t>
       </w:r>
     </w:p>
     <w:p>
@@ -720,7 +1055,7 @@
           <w:color w:val="2E74B5"/>
           <w:sz w:val="32"/>
         </w:rPr>
-        <w:t>7. AI 审阅与灯光审片</w:t>
+        <w:t>8. AI 审阅与灯光审片</w:t>
       </w:r>
     </w:p>
     <w:p>
@@ -1139,7 +1474,7 @@
           <w:color w:val="2E74B5"/>
           <w:sz w:val="32"/>
         </w:rPr>
-        <w:t>8. 优化实验室</w:t>
+        <w:t>9. 优化实验室</w:t>
       </w:r>
     </w:p>
     <w:p>
@@ -1378,7 +1713,7 @@
           <w:color w:val="2E74B5"/>
           <w:sz w:val="32"/>
         </w:rPr>
-        <w:t>9. 文件与安全</w:t>
+        <w:t>10. 文件与安全</w:t>
       </w:r>
     </w:p>
     <w:p>
@@ -1468,6 +1803,23 @@
     </w:p>
     <w:p>
       <w:pPr>
+        <w:spacing w:before="0" w:after="80" w:line="300" w:lineRule="auto"/>
+        <w:numPr>
+          <w:ilvl w:val="0"/>
+          <w:numId w:val="10"/>
+        </w:numPr>
+      </w:pPr>
+      <w:r>
+        <w:rPr>
+          <w:rFonts w:ascii="Calibri" w:hAnsi="Calibri" w:eastAsia="Microsoft YaHei UI"/>
+          <w:b w:val="0"/>
+          <w:sz w:val="22"/>
+        </w:rPr>
+        <w:t>作品研究的 assets 同样保留导入图片原始字节；study.json 保存研究状态。</w:t>
+      </w:r>
+    </w:p>
+    <w:p>
+      <w:pPr>
         <w:pStyle w:val="Heading1"/>
       </w:pPr>
       <w:r>
@@ -1477,7 +1829,7 @@
           <w:color w:val="2E74B5"/>
           <w:sz w:val="32"/>
         </w:rPr>
-        <w:t>10. 当前限制</w:t>
+        <w:t>11. 当前限制</w:t>
       </w:r>
     </w:p>
     <w:p>
@@ -1546,6 +1898,23 @@
           <w:sz w:val="22"/>
         </w:rPr>
         <w:t>AI 预演必须回到 UE 实施，并用新的真实截图 Version 正式复查。</w:t>
+      </w:r>
+    </w:p>
+    <w:p>
+      <w:pPr>
+        <w:spacing w:before="0" w:after="80" w:line="300" w:lineRule="auto"/>
+        <w:numPr>
+          <w:ilvl w:val="0"/>
+          <w:numId w:val="10"/>
+        </w:numPr>
+      </w:pPr>
+      <w:r>
+        <w:rPr>
+          <w:rFonts w:ascii="Calibri" w:hAnsi="Calibri" w:eastAsia="Microsoft YaHei UI"/>
+          <w:b w:val="0"/>
+          <w:sz w:val="22"/>
+        </w:rPr>
+        <w:t>作品研究暂不支持多图研究、引用资料库、自动语义分割或本地大型视觉模型。</w:t>
       </w:r>
     </w:p>
     <w:sectPr>

</xml_diff>

<commit_message>
fix(providers): retry remote connection closures
</commit_message>
<xml_diff>
--- a/SceneLens_使用手册.docx
+++ b/SceneLens_使用手册.docx
@@ -27,7 +27,7 @@
           <w:color w:val="5A5A5A"/>
           <w:sz w:val="19"/>
         </w:rPr>
-        <w:t>适用版本：0.6.0a0（M5 作品研究候选）　更新日期：2026-07-30</w:t>
+        <w:t>适用版本：0.6.0a1（M5 作品研究网络修正版）　更新日期：2026-07-30</w:t>
       </w:r>
     </w:p>
     <w:p>
@@ -1264,6 +1264,40 @@
           <w:sz w:val="26"/>
         </w:rPr>
         <w:t>AI 接口失败时</w:t>
+      </w:r>
+    </w:p>
+    <w:p>
+      <w:pPr>
+        <w:spacing w:before="0" w:after="80" w:line="300" w:lineRule="auto"/>
+        <w:numPr>
+          <w:ilvl w:val="0"/>
+          <w:numId w:val="10"/>
+        </w:numPr>
+      </w:pPr>
+      <w:r>
+        <w:rPr>
+          <w:rFonts w:ascii="Calibri" w:hAnsi="Calibri" w:eastAsia="Microsoft YaHei UI"/>
+          <w:b w:val="0"/>
+          <w:sz w:val="22"/>
+        </w:rPr>
+        <w:t>connection_closed：远端或中间网络设备提前断开连接，不表示 API Key 错误。新版会自动退避重试 3 次；仍失败时检查代理、VPN 和网络稳定性。</w:t>
+      </w:r>
+    </w:p>
+    <w:p>
+      <w:pPr>
+        <w:spacing w:before="0" w:after="80" w:line="300" w:lineRule="auto"/>
+        <w:numPr>
+          <w:ilvl w:val="0"/>
+          <w:numId w:val="10"/>
+        </w:numPr>
+      </w:pPr>
+      <w:r>
+        <w:rPr>
+          <w:rFonts w:ascii="Calibri" w:hAnsi="Calibri" w:eastAsia="Microsoft YaHei UI"/>
+          <w:b w:val="0"/>
+          <w:sz w:val="22"/>
+        </w:rPr>
+        <w:t>自动重试可能重复提交同一请求并产生额外费用，发送确认窗口会提前提示。</w:t>
       </w:r>
     </w:p>
     <w:p>

</xml_diff>

<commit_message>
fix(artwork-study): enforce simplified Chinese output
</commit_message>
<xml_diff>
--- a/SceneLens_使用手册.docx
+++ b/SceneLens_使用手册.docx
@@ -27,7 +27,7 @@
           <w:color w:val="5A5A5A"/>
           <w:sz w:val="19"/>
         </w:rPr>
-        <w:t>适用版本：0.6.0a1（M5 作品研究网络修正版）　更新日期：2026-07-30</w:t>
+        <w:t>适用版本：0.6.0a2（M5 作品研究简体中文修正版）　更新日期：2026-07-30</w:t>
       </w:r>
     </w:p>
     <w:p>
@@ -479,6 +479,57 @@
           <w:sz w:val="22"/>
         </w:rPr>
         <w:t>另外显示跨维度因果链、具体场景内容、画面标注、可迁移规律和继续观察问题。</w:t>
+      </w:r>
+    </w:p>
+    <w:p>
+      <w:pPr>
+        <w:spacing w:before="0" w:after="80" w:line="300" w:lineRule="auto"/>
+        <w:numPr>
+          <w:ilvl w:val="0"/>
+          <w:numId w:val="10"/>
+        </w:numPr>
+      </w:pPr>
+      <w:r>
+        <w:rPr>
+          <w:rFonts w:ascii="Calibri" w:hAnsi="Calibri" w:eastAsia="Microsoft YaHei UI"/>
+          <w:b w:val="0"/>
+          <w:sz w:val="22"/>
+        </w:rPr>
+        <w:t>所有面向用户的 AI 内容固定使用简体中文，内部评价状态也会转换为中文。</w:t>
+      </w:r>
+    </w:p>
+    <w:p>
+      <w:pPr>
+        <w:spacing w:before="0" w:after="80" w:line="300" w:lineRule="auto"/>
+        <w:numPr>
+          <w:ilvl w:val="0"/>
+          <w:numId w:val="10"/>
+        </w:numPr>
+      </w:pPr>
+      <w:r>
+        <w:rPr>
+          <w:rFonts w:ascii="Calibri" w:hAnsi="Calibri" w:eastAsia="Microsoft YaHei UI"/>
+          <w:b w:val="0"/>
+          <w:sz w:val="22"/>
+        </w:rPr>
+        <w:t>若首次返回英文或繁体中文，软件最多追加一次不含图片的中文规范化请求；发送确认窗口会提示可能增加费用。</w:t>
+      </w:r>
+    </w:p>
+    <w:p>
+      <w:pPr>
+        <w:spacing w:before="0" w:after="80" w:line="300" w:lineRule="auto"/>
+        <w:numPr>
+          <w:ilvl w:val="0"/>
+          <w:numId w:val="10"/>
+        </w:numPr>
+      </w:pPr>
+      <w:r>
+        <w:rPr>
+          <w:rFonts w:ascii="Calibri" w:hAnsi="Calibri" w:eastAsia="Microsoft YaHei UI"/>
+          <w:b w:val="0"/>
+          <w:sz w:val="22"/>
+        </w:rPr>
+        <w:t>旧版英文结果不会被本地硬翻译或继续展示，重新审阅即可生成中文结果。</w:t>
       </w:r>
     </w:p>
     <w:p>

</xml_diff>

<commit_message>
fix(providers): add bounded model fallback for 503 capacity
</commit_message>
<xml_diff>
--- a/SceneLens_使用手册.docx
+++ b/SceneLens_使用手册.docx
@@ -27,7 +27,7 @@
           <w:color w:val="5A5A5A"/>
           <w:sz w:val="19"/>
         </w:rPr>
-        <w:t>适用版本：0.6.0a2（M5 作品研究简体中文修正版）　更新日期：2026-07-30</w:t>
+        <w:t>适用版本：0.6.0a3（Gemini 容量回退修正版）　更新日期：2026-07-30</w:t>
       </w:r>
     </w:p>
     <w:p>
@@ -513,6 +513,23 @@
           <w:sz w:val="22"/>
         </w:rPr>
         <w:t>若首次返回英文或繁体中文，软件最多追加一次不含图片的中文规范化请求；发送确认窗口会提示可能增加费用。</w:t>
+      </w:r>
+    </w:p>
+    <w:p>
+      <w:pPr>
+        <w:spacing w:before="0" w:after="80" w:line="300" w:lineRule="auto"/>
+        <w:numPr>
+          <w:ilvl w:val="0"/>
+          <w:numId w:val="10"/>
+        </w:numPr>
+      </w:pPr>
+      <w:r>
+        <w:rPr>
+          <w:rFonts w:ascii="Calibri" w:hAnsi="Calibri" w:eastAsia="Microsoft YaHei UI"/>
+          <w:b w:val="0"/>
+          <w:sz w:val="22"/>
+        </w:rPr>
+        <w:t>若 Gemini 当前模型重试后仍返回 503 容量不足，软件会按发送清单改用同一供应商的备用模型一次；完成状态会显示实际模型。</w:t>
       </w:r>
     </w:p>
     <w:p>
@@ -1535,7 +1552,41 @@
           <w:b w:val="0"/>
           <w:sz w:val="22"/>
         </w:rPr>
-        <w:t>http_5xx：供应商服务异常，稍后重试。</w:t>
+        <w:t>http_503：供应商当前模型临时过载，不表示 API Key 错误。新版先有限重试；Gemini 仍失败时会按发送清单改用 gemini-2.5-flash 一次，不跨供应商。</w:t>
+      </w:r>
+    </w:p>
+    <w:p>
+      <w:pPr>
+        <w:spacing w:before="0" w:after="80" w:line="300" w:lineRule="auto"/>
+        <w:numPr>
+          <w:ilvl w:val="0"/>
+          <w:numId w:val="10"/>
+        </w:numPr>
+      </w:pPr>
+      <w:r>
+        <w:rPr>
+          <w:rFonts w:ascii="Calibri" w:hAnsi="Calibri" w:eastAsia="Microsoft YaHei UI"/>
+          <w:b w:val="0"/>
+          <w:sz w:val="22"/>
+        </w:rPr>
+        <w:t>发送清单会提前显示备用模型。若发生回退，状态栏和保存记录会显示请求模型、实际模型及回退原因；可能增加一次调用费用。</w:t>
+      </w:r>
+    </w:p>
+    <w:p>
+      <w:pPr>
+        <w:spacing w:before="0" w:after="80" w:line="300" w:lineRule="auto"/>
+        <w:numPr>
+          <w:ilvl w:val="0"/>
+          <w:numId w:val="10"/>
+        </w:numPr>
+      </w:pPr>
+      <w:r>
+        <w:rPr>
+          <w:rFonts w:ascii="Calibri" w:hAnsi="Calibri" w:eastAsia="Microsoft YaHei UI"/>
+          <w:b w:val="0"/>
+          <w:sz w:val="22"/>
+        </w:rPr>
+        <w:t>其他 http_5xx：供应商服务异常，稍后重试。</w:t>
       </w:r>
     </w:p>
     <w:p>

</xml_diff>

<commit_message>
docs(release): validate asset breakdown 0.7.0
</commit_message>
<xml_diff>
--- a/SceneLens_使用手册.docx
+++ b/SceneLens_使用手册.docx
@@ -27,7 +27,7 @@
           <w:color w:val="5A5A5A"/>
           <w:sz w:val="19"/>
         </w:rPr>
-        <w:t>适用版本：0.6.0a3（Gemini 容量回退修正版）　更新日期：2026-07-30</w:t>
+        <w:t>适用版本：0.7.0（资产拆分工作台）　更新日期：2026-07-30</w:t>
       </w:r>
     </w:p>
     <w:p>
@@ -151,6 +151,23 @@
           <w:sz w:val="22"/>
         </w:rPr>
         <w:t>作品研究：分析一张原画、概念图、Color Key 或优秀场景作品。</w:t>
+      </w:r>
+    </w:p>
+    <w:p>
+      <w:pPr>
+        <w:spacing w:before="0" w:after="80" w:line="300" w:lineRule="auto"/>
+        <w:numPr>
+          <w:ilvl w:val="0"/>
+          <w:numId w:val="10"/>
+        </w:numPr>
+      </w:pPr>
+      <w:r>
+        <w:rPr>
+          <w:rFonts w:ascii="Calibri" w:hAnsi="Calibri" w:eastAsia="Microsoft YaHei UI"/>
+          <w:b w:val="0"/>
+          <w:sz w:val="22"/>
+        </w:rPr>
+        <w:t>资产拆分工作台：把复杂场景原画整理为资产清单、区域、生成图和展示板。</w:t>
       </w:r>
     </w:p>
     <w:p>
@@ -601,7 +618,369 @@
           <w:color w:val="2E74B5"/>
           <w:sz w:val="32"/>
         </w:rPr>
-        <w:t>4. 场景美术控制最短流程</w:t>
+        <w:t>4. 资产拆分工作台</w:t>
+      </w:r>
+    </w:p>
+    <w:p>
+      <w:pPr>
+        <w:pStyle w:val="Heading2"/>
+      </w:pPr>
+      <w:r>
+        <w:rPr>
+          <w:rFonts w:ascii="Calibri" w:hAnsi="Calibri" w:eastAsia="Microsoft YaHei UI"/>
+          <w:b/>
+          <w:color w:val="2E74B5"/>
+          <w:sz w:val="26"/>
+        </w:rPr>
+        <w:t>最短流程</w:t>
+      </w:r>
+    </w:p>
+    <w:p>
+      <w:pPr>
+        <w:spacing w:before="0" w:after="80" w:line="300" w:lineRule="auto"/>
+        <w:numPr>
+          <w:ilvl w:val="0"/>
+          <w:numId w:val="11"/>
+        </w:numPr>
+      </w:pPr>
+      <w:r>
+        <w:rPr>
+          <w:rFonts w:ascii="Calibri" w:hAnsi="Calibri" w:eastAsia="Microsoft YaHei UI"/>
+          <w:b w:val="0"/>
+          <w:sz w:val="22"/>
+        </w:rPr>
+        <w:t>在首页进入“资产拆分工作台”，新建资产项目。</w:t>
+      </w:r>
+    </w:p>
+    <w:p>
+      <w:pPr>
+        <w:spacing w:before="0" w:after="80" w:line="300" w:lineRule="auto"/>
+        <w:numPr>
+          <w:ilvl w:val="0"/>
+          <w:numId w:val="11"/>
+        </w:numPr>
+      </w:pPr>
+      <w:r>
+        <w:rPr>
+          <w:rFonts w:ascii="Calibri" w:hAnsi="Calibri" w:eastAsia="Microsoft YaHei UI"/>
+          <w:b w:val="0"/>
+          <w:sz w:val="22"/>
+        </w:rPr>
+        <w:t>选择场景类型，填写制作目标，导入主原画；补充参考可选。</w:t>
+      </w:r>
+    </w:p>
+    <w:p>
+      <w:pPr>
+        <w:spacing w:before="0" w:after="80" w:line="300" w:lineRule="auto"/>
+        <w:numPr>
+          <w:ilvl w:val="0"/>
+          <w:numId w:val="11"/>
+        </w:numPr>
+      </w:pPr>
+      <w:r>
+        <w:rPr>
+          <w:rFonts w:ascii="Calibri" w:hAnsi="Calibri" w:eastAsia="Microsoft YaHei UI"/>
+          <w:b w:val="0"/>
+          <w:sz w:val="22"/>
+        </w:rPr>
+        <w:t>选择视觉供应商，查看发送清单并主动确认。</w:t>
+      </w:r>
+    </w:p>
+    <w:p>
+      <w:pPr>
+        <w:spacing w:before="0" w:after="80" w:line="300" w:lineRule="auto"/>
+        <w:numPr>
+          <w:ilvl w:val="0"/>
+          <w:numId w:val="11"/>
+        </w:numPr>
+      </w:pPr>
+      <w:r>
+        <w:rPr>
+          <w:rFonts w:ascii="Calibri" w:hAnsi="Calibri" w:eastAsia="Microsoft YaHei UI"/>
+          <w:b w:val="0"/>
+          <w:sz w:val="22"/>
+        </w:rPr>
+        <w:t>检查资产分类、层级、复用组、优先级和原图区域。</w:t>
+      </w:r>
+    </w:p>
+    <w:p>
+      <w:pPr>
+        <w:spacing w:before="0" w:after="80" w:line="300" w:lineRule="auto"/>
+        <w:numPr>
+          <w:ilvl w:val="0"/>
+          <w:numId w:val="11"/>
+        </w:numPr>
+      </w:pPr>
+      <w:r>
+        <w:rPr>
+          <w:rFonts w:ascii="Calibri" w:hAnsi="Calibri" w:eastAsia="Microsoft YaHei UI"/>
+          <w:b w:val="0"/>
+          <w:sz w:val="22"/>
+        </w:rPr>
+        <w:t>拖动区域或在“资产详情”修改名称、分类、父级、证据和制作策略。</w:t>
+      </w:r>
+    </w:p>
+    <w:p>
+      <w:pPr>
+        <w:spacing w:before="0" w:after="80" w:line="300" w:lineRule="auto"/>
+        <w:numPr>
+          <w:ilvl w:val="0"/>
+          <w:numId w:val="11"/>
+        </w:numPr>
+      </w:pPr>
+      <w:r>
+        <w:rPr>
+          <w:rFonts w:ascii="Calibri" w:hAnsi="Calibri" w:eastAsia="Microsoft YaHei UI"/>
+          <w:b w:val="0"/>
+          <w:sz w:val="22"/>
+        </w:rPr>
+        <w:t>可新增、拆分、合并或删除资产；用户修订不会被后续 AI 覆盖。</w:t>
+      </w:r>
+    </w:p>
+    <w:p>
+      <w:pPr>
+        <w:spacing w:before="0" w:after="80" w:line="300" w:lineRule="auto"/>
+        <w:numPr>
+          <w:ilvl w:val="0"/>
+          <w:numId w:val="11"/>
+        </w:numPr>
+      </w:pPr>
+      <w:r>
+        <w:rPr>
+          <w:rFonts w:ascii="Calibri" w:hAnsi="Calibri" w:eastAsia="Microsoft YaHei UI"/>
+          <w:b w:val="0"/>
+          <w:sz w:val="22"/>
+        </w:rPr>
+        <w:t>在清单第一列勾选需要生成的资产。</w:t>
+      </w:r>
+    </w:p>
+    <w:p>
+      <w:pPr>
+        <w:spacing w:before="0" w:after="80" w:line="300" w:lineRule="auto"/>
+        <w:numPr>
+          <w:ilvl w:val="0"/>
+          <w:numId w:val="11"/>
+        </w:numPr>
+      </w:pPr>
+      <w:r>
+        <w:rPr>
+          <w:rFonts w:ascii="Calibri" w:hAnsi="Calibri" w:eastAsia="Microsoft YaHei UI"/>
+          <w:b w:val="0"/>
+          <w:sz w:val="22"/>
+        </w:rPr>
+        <w:t>在“生成与导出”选择独立概念图、保守遮挡补全图或评审展示图。</w:t>
+      </w:r>
+    </w:p>
+    <w:p>
+      <w:pPr>
+        <w:spacing w:before="0" w:after="80" w:line="300" w:lineRule="auto"/>
+        <w:numPr>
+          <w:ilvl w:val="0"/>
+          <w:numId w:val="11"/>
+        </w:numPr>
+      </w:pPr>
+      <w:r>
+        <w:rPr>
+          <w:rFonts w:ascii="Calibri" w:hAnsi="Calibri" w:eastAsia="Microsoft YaHei UI"/>
+          <w:b w:val="0"/>
+          <w:sz w:val="22"/>
+        </w:rPr>
+        <w:t>查看发送清单并确认；取消时已完成项仍会保留。</w:t>
+      </w:r>
+    </w:p>
+    <w:p>
+      <w:pPr>
+        <w:spacing w:before="0" w:after="80" w:line="300" w:lineRule="auto"/>
+        <w:numPr>
+          <w:ilvl w:val="0"/>
+          <w:numId w:val="11"/>
+        </w:numPr>
+      </w:pPr>
+      <w:r>
+        <w:rPr>
+          <w:rFonts w:ascii="Calibri" w:hAnsi="Calibri" w:eastAsia="Microsoft YaHei UI"/>
+          <w:b w:val="0"/>
+          <w:sz w:val="22"/>
+        </w:rPr>
+        <w:t>导出单项图片、asset_board.png 和 asset_manifest.json。</w:t>
+      </w:r>
+    </w:p>
+    <w:p>
+      <w:pPr>
+        <w:pStyle w:val="Heading2"/>
+      </w:pPr>
+      <w:r>
+        <w:rPr>
+          <w:rFonts w:ascii="Calibri" w:hAnsi="Calibri" w:eastAsia="Microsoft YaHei UI"/>
+          <w:b/>
+          <w:color w:val="2E74B5"/>
+          <w:sz w:val="26"/>
+        </w:rPr>
+        <w:t>画布与遮罩</w:t>
+      </w:r>
+    </w:p>
+    <w:p>
+      <w:pPr>
+        <w:spacing w:before="0" w:after="80" w:line="300" w:lineRule="auto"/>
+        <w:numPr>
+          <w:ilvl w:val="0"/>
+          <w:numId w:val="10"/>
+        </w:numPr>
+      </w:pPr>
+      <w:r>
+        <w:rPr>
+          <w:rFonts w:ascii="Calibri" w:hAnsi="Calibri" w:eastAsia="Microsoft YaHei UI"/>
+          <w:b w:val="0"/>
+          <w:sz w:val="22"/>
+        </w:rPr>
+        <w:t>“框选资产”后在原画拖出矩形；可移动或拉动手柄调整。</w:t>
+      </w:r>
+    </w:p>
+    <w:p>
+      <w:pPr>
+        <w:spacing w:before="0" w:after="80" w:line="300" w:lineRule="auto"/>
+        <w:numPr>
+          <w:ilvl w:val="0"/>
+          <w:numId w:val="10"/>
+        </w:numPr>
+      </w:pPr>
+      <w:r>
+        <w:rPr>
+          <w:rFonts w:ascii="Calibri" w:hAnsi="Calibri" w:eastAsia="Microsoft YaHei UI"/>
+          <w:b w:val="0"/>
+          <w:sz w:val="22"/>
+        </w:rPr>
+        <w:t>“可见遮罩”只显示矩形内的算法近似像素，不是精确实例分割。</w:t>
+      </w:r>
+    </w:p>
+    <w:p>
+      <w:pPr>
+        <w:spacing w:before="0" w:after="80" w:line="300" w:lineRule="auto"/>
+        <w:numPr>
+          <w:ilvl w:val="0"/>
+          <w:numId w:val="10"/>
+        </w:numPr>
+      </w:pPr>
+      <w:r>
+        <w:rPr>
+          <w:rFonts w:ascii="Calibri" w:hAnsi="Calibri" w:eastAsia="Microsoft YaHei UI"/>
+          <w:b w:val="0"/>
+          <w:sz w:val="22"/>
+        </w:rPr>
+        <w:t>按 Esc 退出框选或遮罩。原始图片不会被修改。</w:t>
+      </w:r>
+    </w:p>
+    <w:p>
+      <w:pPr>
+        <w:pStyle w:val="Heading2"/>
+      </w:pPr>
+      <w:r>
+        <w:rPr>
+          <w:rFonts w:ascii="Calibri" w:hAnsi="Calibri" w:eastAsia="Microsoft YaHei UI"/>
+          <w:b/>
+          <w:color w:val="2E74B5"/>
+          <w:sz w:val="26"/>
+        </w:rPr>
+        <w:t>信息来源</w:t>
+      </w:r>
+    </w:p>
+    <w:p>
+      <w:pPr>
+        <w:spacing w:before="0" w:after="80" w:line="300" w:lineRule="auto"/>
+        <w:numPr>
+          <w:ilvl w:val="0"/>
+          <w:numId w:val="10"/>
+        </w:numPr>
+      </w:pPr>
+      <w:r>
+        <w:rPr>
+          <w:rFonts w:ascii="Calibri" w:hAnsi="Calibri" w:eastAsia="Microsoft YaHei UI"/>
+          <w:b w:val="0"/>
+          <w:sz w:val="22"/>
+        </w:rPr>
+        <w:t>原画可见证据：能直接从图中核对。</w:t>
+      </w:r>
+    </w:p>
+    <w:p>
+      <w:pPr>
+        <w:spacing w:before="0" w:after="80" w:line="300" w:lineRule="auto"/>
+        <w:numPr>
+          <w:ilvl w:val="0"/>
+          <w:numId w:val="10"/>
+        </w:numPr>
+      </w:pPr>
+      <w:r>
+        <w:rPr>
+          <w:rFonts w:ascii="Calibri" w:hAnsi="Calibri" w:eastAsia="Microsoft YaHei UI"/>
+          <w:b w:val="0"/>
+          <w:sz w:val="22"/>
+        </w:rPr>
+        <w:t>AI 推断：类别、模块边界、复用或结构判断。</w:t>
+      </w:r>
+    </w:p>
+    <w:p>
+      <w:pPr>
+        <w:spacing w:before="0" w:after="80" w:line="300" w:lineRule="auto"/>
+        <w:numPr>
+          <w:ilvl w:val="0"/>
+          <w:numId w:val="10"/>
+        </w:numPr>
+      </w:pPr>
+      <w:r>
+        <w:rPr>
+          <w:rFonts w:ascii="Calibri" w:hAnsi="Calibri" w:eastAsia="Microsoft YaHei UI"/>
+          <w:b w:val="0"/>
+          <w:sz w:val="22"/>
+        </w:rPr>
+        <w:t>用户补充／修订：用户确认后的内容，优先级最高。</w:t>
+      </w:r>
+    </w:p>
+    <w:p>
+      <w:pPr>
+        <w:spacing w:before="0" w:after="80" w:line="300" w:lineRule="auto"/>
+        <w:numPr>
+          <w:ilvl w:val="0"/>
+          <w:numId w:val="10"/>
+        </w:numPr>
+      </w:pPr>
+      <w:r>
+        <w:rPr>
+          <w:rFonts w:ascii="Calibri" w:hAnsi="Calibri" w:eastAsia="Microsoft YaHei UI"/>
+          <w:b w:val="0"/>
+          <w:sz w:val="22"/>
+        </w:rPr>
+        <w:t>AI 生成补全：不可见部分的概念假设，不是原画事实。</w:t>
+      </w:r>
+    </w:p>
+    <w:p>
+      <w:pPr>
+        <w:spacing w:before="0" w:after="80" w:line="300" w:lineRule="auto"/>
+        <w:numPr>
+          <w:ilvl w:val="0"/>
+          <w:numId w:val="10"/>
+        </w:numPr>
+      </w:pPr>
+      <w:r>
+        <w:rPr>
+          <w:rFonts w:ascii="Calibri" w:hAnsi="Calibri" w:eastAsia="Microsoft YaHei UI"/>
+          <w:b w:val="0"/>
+          <w:sz w:val="22"/>
+        </w:rPr>
+        <w:t>离线 Mock 只验证清单、保存、遮罩、生成和导出流程，不分析图片语义。</w:t>
+      </w:r>
+    </w:p>
+    <w:p>
+      <w:pPr>
+        <w:pStyle w:val="Heading1"/>
+      </w:pPr>
+      <w:r>
+        <w:rPr>
+          <w:rFonts w:ascii="Calibri" w:hAnsi="Calibri" w:eastAsia="Microsoft YaHei UI"/>
+          <w:b/>
+          <w:color w:val="2E74B5"/>
+          <w:sz w:val="32"/>
+        </w:rPr>
+        <w:t>5. 场景美术控制最短流程</w:t>
       </w:r>
     </w:p>
     <w:p>
@@ -761,7 +1140,7 @@
           <w:color w:val="2E74B5"/>
           <w:sz w:val="32"/>
         </w:rPr>
-        <w:t>5. 场景图片查看与基础分析</w:t>
+        <w:t>6. 场景图片查看与基础分析</w:t>
       </w:r>
     </w:p>
     <w:p>
@@ -887,7 +1266,7 @@
           <w:color w:val="2E74B5"/>
           <w:sz w:val="32"/>
         </w:rPr>
-        <w:t>6. 对比分析</w:t>
+        <w:t>7. 对比分析</w:t>
       </w:r>
     </w:p>
     <w:p>
@@ -1041,7 +1420,7 @@
           <w:color w:val="2E74B5"/>
           <w:sz w:val="32"/>
         </w:rPr>
-        <w:t>7. 制作意图与参考图视觉简报</w:t>
+        <w:t>8. 制作意图与参考图视觉简报</w:t>
       </w:r>
     </w:p>
     <w:p>
@@ -1123,7 +1502,7 @@
           <w:color w:val="2E74B5"/>
           <w:sz w:val="32"/>
         </w:rPr>
-        <w:t>8. AI 审阅与灯光审片</w:t>
+        <w:t>9. AI 审阅与灯光审片</w:t>
       </w:r>
     </w:p>
     <w:p>
@@ -1433,6 +1812,23 @@
           <w:b w:val="0"/>
           <w:sz w:val="22"/>
         </w:rPr>
+        <w:t>finish_reason=MAX_TOKENS：AI 回答过长导致 JSON 尾部被截断，不表示 API Key 错误。新版会压缩内容，并只在明确截断时用更高预算纠错一次。</w:t>
+      </w:r>
+    </w:p>
+    <w:p>
+      <w:pPr>
+        <w:spacing w:before="0" w:after="80" w:line="300" w:lineRule="auto"/>
+        <w:numPr>
+          <w:ilvl w:val="0"/>
+          <w:numId w:val="10"/>
+        </w:numPr>
+      </w:pPr>
+      <w:r>
+        <w:rPr>
+          <w:rFonts w:ascii="Calibri" w:hAnsi="Calibri" w:eastAsia="Microsoft YaHei UI"/>
+          <w:b w:val="0"/>
+          <w:sz w:val="22"/>
+        </w:rPr>
         <w:t>错误中的 line 和 column 表示 AI 返回文本的 JSON 损坏位置，不表示 API Key 错误。0.5.0a4 会把原始返回交给同一模型压缩并修复；第二次仍损坏时停止，不会无限重试。</w:t>
       </w:r>
     </w:p>
@@ -1610,7 +2006,7 @@
           <w:color w:val="2E74B5"/>
           <w:sz w:val="32"/>
         </w:rPr>
-        <w:t>9. 优化实验室</w:t>
+        <w:t>10. 优化实验室</w:t>
       </w:r>
     </w:p>
     <w:p>
@@ -1849,7 +2245,7 @@
           <w:color w:val="2E74B5"/>
           <w:sz w:val="32"/>
         </w:rPr>
-        <w:t>10. 文件与安全</w:t>
+        <w:t>11. 文件与安全</w:t>
       </w:r>
     </w:p>
     <w:p>
@@ -1956,6 +2352,23 @@
     </w:p>
     <w:p>
       <w:pPr>
+        <w:spacing w:before="0" w:after="80" w:line="300" w:lineRule="auto"/>
+        <w:numPr>
+          <w:ilvl w:val="0"/>
+          <w:numId w:val="10"/>
+        </w:numPr>
+      </w:pPr>
+      <w:r>
+        <w:rPr>
+          <w:rFonts w:ascii="Calibri" w:hAnsi="Calibri" w:eastAsia="Microsoft YaHei UI"/>
+          <w:b w:val="0"/>
+          <w:sz w:val="22"/>
+        </w:rPr>
+        <w:t>资产拆分项目使用 .scenelens-assets 目录；生成图、遮罩和导出记录与原图分开保存。</w:t>
+      </w:r>
+    </w:p>
+    <w:p>
+      <w:pPr>
         <w:pStyle w:val="Heading1"/>
       </w:pPr>
       <w:r>
@@ -1965,7 +2378,7 @@
           <w:color w:val="2E74B5"/>
           <w:sz w:val="32"/>
         </w:rPr>
-        <w:t>11. 当前限制</w:t>
+        <w:t>12. 当前限制</w:t>
       </w:r>
     </w:p>
     <w:p>
@@ -2051,6 +2464,40 @@
           <w:sz w:val="22"/>
         </w:rPr>
         <w:t>作品研究暂不支持多图研究、引用资料库、自动语义分割或本地大型视觉模型。</w:t>
+      </w:r>
+    </w:p>
+    <w:p>
+      <w:pPr>
+        <w:spacing w:before="0" w:after="80" w:line="300" w:lineRule="auto"/>
+        <w:numPr>
+          <w:ilvl w:val="0"/>
+          <w:numId w:val="10"/>
+        </w:numPr>
+      </w:pPr>
+      <w:r>
+        <w:rPr>
+          <w:rFonts w:ascii="Calibri" w:hAnsi="Calibri" w:eastAsia="Microsoft YaHei UI"/>
+          <w:b w:val="0"/>
+          <w:sz w:val="22"/>
+        </w:rPr>
+        <w:t>资产拆分不捆绑本地视觉大模型、SAM 2 或 CUDA，也不生成生产可用三维模型。</w:t>
+      </w:r>
+    </w:p>
+    <w:p>
+      <w:pPr>
+        <w:spacing w:before="0" w:after="80" w:line="300" w:lineRule="auto"/>
+        <w:numPr>
+          <w:ilvl w:val="0"/>
+          <w:numId w:val="10"/>
+        </w:numPr>
+      </w:pPr>
+      <w:r>
+        <w:rPr>
+          <w:rFonts w:ascii="Calibri" w:hAnsi="Calibri" w:eastAsia="Microsoft YaHei UI"/>
+          <w:b w:val="0"/>
+          <w:sz w:val="22"/>
+        </w:rPr>
+        <w:t>AI 资产分类、遮挡补全和生成图仍需用户人工校正。</w:t>
       </w:r>
     </w:p>
     <w:sectPr>

</xml_diff>